<commit_message>
Audit complet backend : cleanup, docs API, Postman collection, 21/21 tests
Backend:
- Suppression code mort : dashboardController, dashboardRoutes, dashboardService
- Suppression imports/functions inutilisés dans authController, authMiddleware, disputeHistoryService
- Suppression logs debug (console.log) dans authController et authMiddleware
- Correction code erreur doublon 40010 → 40070 pour login
- Ajout comments.js + utils/jwt.js frontend
- Seed database : 3 users, 2 cards, 6 transactions, 10 disputes (9 statuts + 1 CLOSED), 38 historiques, 38 commentaires, 2 documents

Documentation:
- API_DOCUMENTATION.md réécrit : 11 endpoints CDC, 36 codes erreur, diagramme workflow 9 états
- Collection Postman réécrite : 30 requêtes, workflow complet SUBMITTED→CLOSED, 6 tests transitions invalides, tests auth/validation

Frontend: correctifs UI, preferences context, pages operator/client
</commit_message>
<xml_diff>
--- a/docs/Rapport_PFA_Chap1_Chap2_EtharYoussra.docx
+++ b/docs/Rapport_PFA_Chap1_Chap2_EtharYoussra.docx
@@ -2,18 +2,6 @@
 <file path=word/document.xml><?xml version="1.0" encoding="utf-8"?>
 <w:document xmlns:wpc="http://schemas.microsoft.com/office/word/2010/wordprocessingCanvas" xmlns:mc="http://schemas.openxmlformats.org/markup-compatibility/2006" xmlns:o="urn:schemas-microsoft-com:office:office" xmlns:r="http://schemas.openxmlformats.org/officeDocument/2006/relationships" xmlns:m="http://schemas.openxmlformats.org/officeDocument/2006/math" xmlns:v="urn:schemas-microsoft-com:vml" xmlns:wp14="http://schemas.microsoft.com/office/word/2010/wordprocessingDrawing" xmlns:wp="http://schemas.openxmlformats.org/drawingml/2006/wordprocessingDrawing" xmlns:w10="urn:schemas-microsoft-com:office:word" xmlns:w="http://schemas.openxmlformats.org/wordprocessingml/2006/main" xmlns:w14="http://schemas.microsoft.com/office/word/2010/wordml" xmlns:w15="http://schemas.microsoft.com/office/word/2012/wordml" xmlns:wpg="http://schemas.microsoft.com/office/word/2010/wordprocessingGroup" xmlns:wpi="http://schemas.microsoft.com/office/word/2010/wordprocessingInk" xmlns:wne="http://schemas.microsoft.com/office/word/2006/wordml" xmlns:wps="http://schemas.microsoft.com/office/word/2010/wordprocessingShape" mc:Ignorable="w14 w15 wp14">
   <w:body>
-    <w:p>
-      <w:pPr>
-        <w:numPr>
-          <w:ilvl w:val="0"/>
-          <w:numId w:val="3"/>
-        </w:numPr>
-        <w:spacing w:after="160" w:line="278" w:lineRule="auto"/>
-      </w:pPr>
-      <w:r>
-        <w:t xml:space="preserve">Modélisation de la base de données </w:t>
-      </w:r>
-    </w:p>
     <w:p>
       <w:pPr>
         <w:spacing w:before="200" w:after="100"/>
@@ -236,6 +224,7 @@
         <w:alias w:val="Sommaire"/>
         <w:id w:val="-322046957"/>
       </w:sdtPr>
+      <w:sdtEndPr/>
       <w:sdtContent>
         <w:p>
           <w:pPr>
@@ -2142,12 +2131,6 @@
         <w:gridCol w:w="3600"/>
       </w:tblGrid>
       <w:tr>
-        <w:tblPrEx>
-          <w:tblCellMar>
-            <w:top w:w="0" w:type="dxa"/>
-            <w:bottom w:w="0" w:type="dxa"/>
-          </w:tblCellMar>
-        </w:tblPrEx>
         <w:trPr>
           <w:tblHeader/>
         </w:trPr>
@@ -2228,12 +2211,6 @@
         </w:tc>
       </w:tr>
       <w:tr>
-        <w:tblPrEx>
-          <w:tblCellMar>
-            <w:top w:w="0" w:type="dxa"/>
-            <w:bottom w:w="0" w:type="dxa"/>
-          </w:tblCellMar>
-        </w:tblPrEx>
         <w:tc>
           <w:tcPr>
             <w:tcW w:w="1600" w:type="dxa"/>
@@ -2305,12 +2282,6 @@
         </w:tc>
       </w:tr>
       <w:tr>
-        <w:tblPrEx>
-          <w:tblCellMar>
-            <w:top w:w="0" w:type="dxa"/>
-            <w:bottom w:w="0" w:type="dxa"/>
-          </w:tblCellMar>
-        </w:tblPrEx>
         <w:tc>
           <w:tcPr>
             <w:tcW w:w="1600" w:type="dxa"/>
@@ -2382,12 +2353,6 @@
         </w:tc>
       </w:tr>
       <w:tr>
-        <w:tblPrEx>
-          <w:tblCellMar>
-            <w:top w:w="0" w:type="dxa"/>
-            <w:bottom w:w="0" w:type="dxa"/>
-          </w:tblCellMar>
-        </w:tblPrEx>
         <w:tc>
           <w:tcPr>
             <w:tcW w:w="1600" w:type="dxa"/>
@@ -2459,12 +2424,6 @@
         </w:tc>
       </w:tr>
       <w:tr>
-        <w:tblPrEx>
-          <w:tblCellMar>
-            <w:top w:w="0" w:type="dxa"/>
-            <w:bottom w:w="0" w:type="dxa"/>
-          </w:tblCellMar>
-        </w:tblPrEx>
         <w:tc>
           <w:tcPr>
             <w:tcW w:w="1600" w:type="dxa"/>
@@ -2536,12 +2495,6 @@
         </w:tc>
       </w:tr>
       <w:tr>
-        <w:tblPrEx>
-          <w:tblCellMar>
-            <w:top w:w="0" w:type="dxa"/>
-            <w:bottom w:w="0" w:type="dxa"/>
-          </w:tblCellMar>
-        </w:tblPrEx>
         <w:tc>
           <w:tcPr>
             <w:tcW w:w="1600" w:type="dxa"/>
@@ -2744,12 +2697,6 @@
         <w:gridCol w:w="7200"/>
       </w:tblGrid>
       <w:tr>
-        <w:tblPrEx>
-          <w:tblCellMar>
-            <w:top w:w="0" w:type="dxa"/>
-            <w:bottom w:w="0" w:type="dxa"/>
-          </w:tblCellMar>
-        </w:tblPrEx>
         <w:trPr>
           <w:tblHeader/>
         </w:trPr>
@@ -2805,12 +2752,6 @@
         </w:tc>
       </w:tr>
       <w:tr>
-        <w:tblPrEx>
-          <w:tblCellMar>
-            <w:top w:w="0" w:type="dxa"/>
-            <w:bottom w:w="0" w:type="dxa"/>
-          </w:tblCellMar>
-        </w:tblPrEx>
         <w:tc>
           <w:tcPr>
             <w:tcW w:w="2200" w:type="dxa"/>
@@ -2859,12 +2800,6 @@
         </w:tc>
       </w:tr>
       <w:tr>
-        <w:tblPrEx>
-          <w:tblCellMar>
-            <w:top w:w="0" w:type="dxa"/>
-            <w:bottom w:w="0" w:type="dxa"/>
-          </w:tblCellMar>
-        </w:tblPrEx>
         <w:tc>
           <w:tcPr>
             <w:tcW w:w="2200" w:type="dxa"/>
@@ -2976,12 +2911,6 @@
         <w:gridCol w:w="2800"/>
       </w:tblGrid>
       <w:tr>
-        <w:tblPrEx>
-          <w:tblCellMar>
-            <w:top w:w="0" w:type="dxa"/>
-            <w:bottom w:w="0" w:type="dxa"/>
-          </w:tblCellMar>
-        </w:tblPrEx>
         <w:trPr>
           <w:tblHeader/>
         </w:trPr>
@@ -3062,12 +2991,6 @@
         </w:tc>
       </w:tr>
       <w:tr>
-        <w:tblPrEx>
-          <w:tblCellMar>
-            <w:top w:w="0" w:type="dxa"/>
-            <w:bottom w:w="0" w:type="dxa"/>
-          </w:tblCellMar>
-        </w:tblPrEx>
         <w:tc>
           <w:tcPr>
             <w:tcW w:w="900" w:type="dxa"/>
@@ -3139,12 +3062,6 @@
         </w:tc>
       </w:tr>
       <w:tr>
-        <w:tblPrEx>
-          <w:tblCellMar>
-            <w:top w:w="0" w:type="dxa"/>
-            <w:bottom w:w="0" w:type="dxa"/>
-          </w:tblCellMar>
-        </w:tblPrEx>
         <w:tc>
           <w:tcPr>
             <w:tcW w:w="900" w:type="dxa"/>
@@ -3216,12 +3133,6 @@
         </w:tc>
       </w:tr>
       <w:tr>
-        <w:tblPrEx>
-          <w:tblCellMar>
-            <w:top w:w="0" w:type="dxa"/>
-            <w:bottom w:w="0" w:type="dxa"/>
-          </w:tblCellMar>
-        </w:tblPrEx>
         <w:tc>
           <w:tcPr>
             <w:tcW w:w="900" w:type="dxa"/>
@@ -3293,12 +3204,6 @@
         </w:tc>
       </w:tr>
       <w:tr>
-        <w:tblPrEx>
-          <w:tblCellMar>
-            <w:top w:w="0" w:type="dxa"/>
-            <w:bottom w:w="0" w:type="dxa"/>
-          </w:tblCellMar>
-        </w:tblPrEx>
         <w:tc>
           <w:tcPr>
             <w:tcW w:w="900" w:type="dxa"/>
@@ -3370,12 +3275,6 @@
         </w:tc>
       </w:tr>
       <w:tr>
-        <w:tblPrEx>
-          <w:tblCellMar>
-            <w:top w:w="0" w:type="dxa"/>
-            <w:bottom w:w="0" w:type="dxa"/>
-          </w:tblCellMar>
-        </w:tblPrEx>
         <w:tc>
           <w:tcPr>
             <w:tcW w:w="900" w:type="dxa"/>
@@ -3447,12 +3346,6 @@
         </w:tc>
       </w:tr>
       <w:tr>
-        <w:tblPrEx>
-          <w:tblCellMar>
-            <w:top w:w="0" w:type="dxa"/>
-            <w:bottom w:w="0" w:type="dxa"/>
-          </w:tblCellMar>
-        </w:tblPrEx>
         <w:tc>
           <w:tcPr>
             <w:tcW w:w="900" w:type="dxa"/>
@@ -3524,12 +3417,6 @@
         </w:tc>
       </w:tr>
       <w:tr>
-        <w:tblPrEx>
-          <w:tblCellMar>
-            <w:top w:w="0" w:type="dxa"/>
-            <w:bottom w:w="0" w:type="dxa"/>
-          </w:tblCellMar>
-        </w:tblPrEx>
         <w:tc>
           <w:tcPr>
             <w:tcW w:w="900" w:type="dxa"/>
@@ -3601,12 +3488,6 @@
         </w:tc>
       </w:tr>
       <w:tr>
-        <w:tblPrEx>
-          <w:tblCellMar>
-            <w:top w:w="0" w:type="dxa"/>
-            <w:bottom w:w="0" w:type="dxa"/>
-          </w:tblCellMar>
-        </w:tblPrEx>
         <w:tc>
           <w:tcPr>
             <w:tcW w:w="900" w:type="dxa"/>
@@ -3678,12 +3559,6 @@
         </w:tc>
       </w:tr>
       <w:tr>
-        <w:tblPrEx>
-          <w:tblCellMar>
-            <w:top w:w="0" w:type="dxa"/>
-            <w:bottom w:w="0" w:type="dxa"/>
-          </w:tblCellMar>
-        </w:tblPrEx>
         <w:tc>
           <w:tcPr>
             <w:tcW w:w="900" w:type="dxa"/>
@@ -3755,12 +3630,6 @@
         </w:tc>
       </w:tr>
       <w:tr>
-        <w:tblPrEx>
-          <w:tblCellMar>
-            <w:top w:w="0" w:type="dxa"/>
-            <w:bottom w:w="0" w:type="dxa"/>
-          </w:tblCellMar>
-        </w:tblPrEx>
         <w:tc>
           <w:tcPr>
             <w:tcW w:w="900" w:type="dxa"/>
@@ -3833,12 +3702,6 @@
         </w:tc>
       </w:tr>
       <w:tr>
-        <w:tblPrEx>
-          <w:tblCellMar>
-            <w:top w:w="0" w:type="dxa"/>
-            <w:bottom w:w="0" w:type="dxa"/>
-          </w:tblCellMar>
-        </w:tblPrEx>
         <w:tc>
           <w:tcPr>
             <w:tcW w:w="900" w:type="dxa"/>
@@ -3910,12 +3773,6 @@
         </w:tc>
       </w:tr>
       <w:tr>
-        <w:tblPrEx>
-          <w:tblCellMar>
-            <w:top w:w="0" w:type="dxa"/>
-            <w:bottom w:w="0" w:type="dxa"/>
-          </w:tblCellMar>
-        </w:tblPrEx>
         <w:tc>
           <w:tcPr>
             <w:tcW w:w="900" w:type="dxa"/>
@@ -3987,12 +3844,6 @@
         </w:tc>
       </w:tr>
       <w:tr>
-        <w:tblPrEx>
-          <w:tblCellMar>
-            <w:top w:w="0" w:type="dxa"/>
-            <w:bottom w:w="0" w:type="dxa"/>
-          </w:tblCellMar>
-        </w:tblPrEx>
         <w:tc>
           <w:tcPr>
             <w:tcW w:w="900" w:type="dxa"/>
@@ -4064,12 +3915,6 @@
         </w:tc>
       </w:tr>
       <w:tr>
-        <w:tblPrEx>
-          <w:tblCellMar>
-            <w:top w:w="0" w:type="dxa"/>
-            <w:bottom w:w="0" w:type="dxa"/>
-          </w:tblCellMar>
-        </w:tblPrEx>
         <w:tc>
           <w:tcPr>
             <w:tcW w:w="900" w:type="dxa"/>
@@ -4141,12 +3986,6 @@
         </w:tc>
       </w:tr>
       <w:tr>
-        <w:tblPrEx>
-          <w:tblCellMar>
-            <w:top w:w="0" w:type="dxa"/>
-            <w:bottom w:w="0" w:type="dxa"/>
-          </w:tblCellMar>
-        </w:tblPrEx>
         <w:tc>
           <w:tcPr>
             <w:tcW w:w="900" w:type="dxa"/>
@@ -4218,12 +4057,6 @@
         </w:tc>
       </w:tr>
       <w:tr>
-        <w:tblPrEx>
-          <w:tblCellMar>
-            <w:top w:w="0" w:type="dxa"/>
-            <w:bottom w:w="0" w:type="dxa"/>
-          </w:tblCellMar>
-        </w:tblPrEx>
         <w:tc>
           <w:tcPr>
             <w:tcW w:w="900" w:type="dxa"/>
@@ -4295,12 +4128,6 @@
         </w:tc>
       </w:tr>
       <w:tr>
-        <w:tblPrEx>
-          <w:tblCellMar>
-            <w:top w:w="0" w:type="dxa"/>
-            <w:bottom w:w="0" w:type="dxa"/>
-          </w:tblCellMar>
-        </w:tblPrEx>
         <w:tc>
           <w:tcPr>
             <w:tcW w:w="900" w:type="dxa"/>
@@ -4417,12 +4244,6 @@
         <w:gridCol w:w="6500"/>
       </w:tblGrid>
       <w:tr>
-        <w:tblPrEx>
-          <w:tblCellMar>
-            <w:top w:w="0" w:type="dxa"/>
-            <w:bottom w:w="0" w:type="dxa"/>
-          </w:tblCellMar>
-        </w:tblPrEx>
         <w:trPr>
           <w:tblHeader/>
         </w:trPr>
@@ -4503,12 +4324,6 @@
         </w:tc>
       </w:tr>
       <w:tr>
-        <w:tblPrEx>
-          <w:tblCellMar>
-            <w:top w:w="0" w:type="dxa"/>
-            <w:bottom w:w="0" w:type="dxa"/>
-          </w:tblCellMar>
-        </w:tblPrEx>
         <w:tc>
           <w:tcPr>
             <w:tcW w:w="900" w:type="dxa"/>
@@ -4580,12 +4395,6 @@
         </w:tc>
       </w:tr>
       <w:tr>
-        <w:tblPrEx>
-          <w:tblCellMar>
-            <w:top w:w="0" w:type="dxa"/>
-            <w:bottom w:w="0" w:type="dxa"/>
-          </w:tblCellMar>
-        </w:tblPrEx>
         <w:tc>
           <w:tcPr>
             <w:tcW w:w="900" w:type="dxa"/>
@@ -4657,12 +4466,6 @@
         </w:tc>
       </w:tr>
       <w:tr>
-        <w:tblPrEx>
-          <w:tblCellMar>
-            <w:top w:w="0" w:type="dxa"/>
-            <w:bottom w:w="0" w:type="dxa"/>
-          </w:tblCellMar>
-        </w:tblPrEx>
         <w:tc>
           <w:tcPr>
             <w:tcW w:w="900" w:type="dxa"/>
@@ -4734,12 +4537,6 @@
         </w:tc>
       </w:tr>
       <w:tr>
-        <w:tblPrEx>
-          <w:tblCellMar>
-            <w:top w:w="0" w:type="dxa"/>
-            <w:bottom w:w="0" w:type="dxa"/>
-          </w:tblCellMar>
-        </w:tblPrEx>
         <w:tc>
           <w:tcPr>
             <w:tcW w:w="900" w:type="dxa"/>
@@ -4811,12 +4608,6 @@
         </w:tc>
       </w:tr>
       <w:tr>
-        <w:tblPrEx>
-          <w:tblCellMar>
-            <w:top w:w="0" w:type="dxa"/>
-            <w:bottom w:w="0" w:type="dxa"/>
-          </w:tblCellMar>
-        </w:tblPrEx>
         <w:tc>
           <w:tcPr>
             <w:tcW w:w="900" w:type="dxa"/>
@@ -4888,12 +4679,6 @@
         </w:tc>
       </w:tr>
       <w:tr>
-        <w:tblPrEx>
-          <w:tblCellMar>
-            <w:top w:w="0" w:type="dxa"/>
-            <w:bottom w:w="0" w:type="dxa"/>
-          </w:tblCellMar>
-        </w:tblPrEx>
         <w:tc>
           <w:tcPr>
             <w:tcW w:w="900" w:type="dxa"/>
@@ -5021,12 +4806,6 @@
         <w:gridCol w:w="3287"/>
       </w:tblGrid>
       <w:tr>
-        <w:tblPrEx>
-          <w:tblCellMar>
-            <w:top w:w="0" w:type="dxa"/>
-            <w:bottom w:w="0" w:type="dxa"/>
-          </w:tblCellMar>
-        </w:tblPrEx>
         <w:trPr>
           <w:tblHeader/>
         </w:trPr>
@@ -5132,12 +4911,6 @@
         </w:tc>
       </w:tr>
       <w:tr>
-        <w:tblPrEx>
-          <w:tblCellMar>
-            <w:top w:w="0" w:type="dxa"/>
-            <w:bottom w:w="0" w:type="dxa"/>
-          </w:tblCellMar>
-        </w:tblPrEx>
         <w:tc>
           <w:tcPr>
             <w:tcW w:w="700" w:type="dxa"/>
@@ -5232,12 +5005,6 @@
         </w:tc>
       </w:tr>
       <w:tr>
-        <w:tblPrEx>
-          <w:tblCellMar>
-            <w:top w:w="0" w:type="dxa"/>
-            <w:bottom w:w="0" w:type="dxa"/>
-          </w:tblCellMar>
-        </w:tblPrEx>
         <w:tc>
           <w:tcPr>
             <w:tcW w:w="700" w:type="dxa"/>
@@ -5332,12 +5099,6 @@
         </w:tc>
       </w:tr>
       <w:tr>
-        <w:tblPrEx>
-          <w:tblCellMar>
-            <w:top w:w="0" w:type="dxa"/>
-            <w:bottom w:w="0" w:type="dxa"/>
-          </w:tblCellMar>
-        </w:tblPrEx>
         <w:tc>
           <w:tcPr>
             <w:tcW w:w="700" w:type="dxa"/>
@@ -5432,12 +5193,6 @@
         </w:tc>
       </w:tr>
       <w:tr>
-        <w:tblPrEx>
-          <w:tblCellMar>
-            <w:top w:w="0" w:type="dxa"/>
-            <w:bottom w:w="0" w:type="dxa"/>
-          </w:tblCellMar>
-        </w:tblPrEx>
         <w:tc>
           <w:tcPr>
             <w:tcW w:w="700" w:type="dxa"/>
@@ -5532,12 +5287,6 @@
         </w:tc>
       </w:tr>
       <w:tr>
-        <w:tblPrEx>
-          <w:tblCellMar>
-            <w:top w:w="0" w:type="dxa"/>
-            <w:bottom w:w="0" w:type="dxa"/>
-          </w:tblCellMar>
-        </w:tblPrEx>
         <w:tc>
           <w:tcPr>
             <w:tcW w:w="700" w:type="dxa"/>
@@ -5632,12 +5381,6 @@
         </w:tc>
       </w:tr>
       <w:tr>
-        <w:tblPrEx>
-          <w:tblCellMar>
-            <w:top w:w="0" w:type="dxa"/>
-            <w:bottom w:w="0" w:type="dxa"/>
-          </w:tblCellMar>
-        </w:tblPrEx>
         <w:tc>
           <w:tcPr>
             <w:tcW w:w="700" w:type="dxa"/>
@@ -5732,12 +5475,6 @@
         </w:tc>
       </w:tr>
       <w:tr>
-        <w:tblPrEx>
-          <w:tblCellMar>
-            <w:top w:w="0" w:type="dxa"/>
-            <w:bottom w:w="0" w:type="dxa"/>
-          </w:tblCellMar>
-        </w:tblPrEx>
         <w:tc>
           <w:tcPr>
             <w:tcW w:w="700" w:type="dxa"/>
@@ -5832,12 +5569,6 @@
         </w:tc>
       </w:tr>
       <w:tr>
-        <w:tblPrEx>
-          <w:tblCellMar>
-            <w:top w:w="0" w:type="dxa"/>
-            <w:bottom w:w="0" w:type="dxa"/>
-          </w:tblCellMar>
-        </w:tblPrEx>
         <w:tc>
           <w:tcPr>
             <w:tcW w:w="700" w:type="dxa"/>
@@ -5932,12 +5663,6 @@
         </w:tc>
       </w:tr>
       <w:tr>
-        <w:tblPrEx>
-          <w:tblCellMar>
-            <w:top w:w="0" w:type="dxa"/>
-            <w:bottom w:w="0" w:type="dxa"/>
-          </w:tblCellMar>
-        </w:tblPrEx>
         <w:tc>
           <w:tcPr>
             <w:tcW w:w="700" w:type="dxa"/>
@@ -6094,6 +5819,8 @@
           </wp:inline>
         </w:drawing>
       </w:r>
+      <w:bookmarkStart w:id="16" w:name="_GoBack"/>
+      <w:bookmarkEnd w:id="16"/>
     </w:p>
     <w:p>
       <w:pPr>
@@ -6116,7 +5843,7 @@
         <w:pStyle w:val="Titre2"/>
         <w:spacing w:before="360" w:after="180"/>
       </w:pPr>
-      <w:bookmarkStart w:id="16" w:name="_Toc234165105"/>
+      <w:bookmarkStart w:id="17" w:name="_Toc234165105"/>
       <w:r>
         <w:rPr>
           <w:b/>
@@ -6126,7 +5853,7 @@
         <w:lastRenderedPageBreak/>
         <w:t>2.6 User stories</w:t>
       </w:r>
-      <w:bookmarkEnd w:id="16"/>
+      <w:bookmarkEnd w:id="17"/>
     </w:p>
     <w:p>
       <w:pPr>
@@ -6160,12 +5887,6 @@
         <w:gridCol w:w="8500"/>
       </w:tblGrid>
       <w:tr>
-        <w:tblPrEx>
-          <w:tblCellMar>
-            <w:top w:w="0" w:type="dxa"/>
-            <w:bottom w:w="0" w:type="dxa"/>
-          </w:tblCellMar>
-        </w:tblPrEx>
         <w:trPr>
           <w:tblHeader/>
         </w:trPr>
@@ -6221,12 +5942,6 @@
         </w:tc>
       </w:tr>
       <w:tr>
-        <w:tblPrEx>
-          <w:tblCellMar>
-            <w:top w:w="0" w:type="dxa"/>
-            <w:bottom w:w="0" w:type="dxa"/>
-          </w:tblCellMar>
-        </w:tblPrEx>
         <w:tc>
           <w:tcPr>
             <w:tcW w:w="900" w:type="dxa"/>
@@ -6275,12 +5990,6 @@
         </w:tc>
       </w:tr>
       <w:tr>
-        <w:tblPrEx>
-          <w:tblCellMar>
-            <w:top w:w="0" w:type="dxa"/>
-            <w:bottom w:w="0" w:type="dxa"/>
-          </w:tblCellMar>
-        </w:tblPrEx>
         <w:tc>
           <w:tcPr>
             <w:tcW w:w="900" w:type="dxa"/>
@@ -6329,12 +6038,6 @@
         </w:tc>
       </w:tr>
       <w:tr>
-        <w:tblPrEx>
-          <w:tblCellMar>
-            <w:top w:w="0" w:type="dxa"/>
-            <w:bottom w:w="0" w:type="dxa"/>
-          </w:tblCellMar>
-        </w:tblPrEx>
         <w:tc>
           <w:tcPr>
             <w:tcW w:w="900" w:type="dxa"/>
@@ -6383,12 +6086,6 @@
         </w:tc>
       </w:tr>
       <w:tr>
-        <w:tblPrEx>
-          <w:tblCellMar>
-            <w:top w:w="0" w:type="dxa"/>
-            <w:bottom w:w="0" w:type="dxa"/>
-          </w:tblCellMar>
-        </w:tblPrEx>
         <w:tc>
           <w:tcPr>
             <w:tcW w:w="900" w:type="dxa"/>
@@ -6437,12 +6134,6 @@
         </w:tc>
       </w:tr>
       <w:tr>
-        <w:tblPrEx>
-          <w:tblCellMar>
-            <w:top w:w="0" w:type="dxa"/>
-            <w:bottom w:w="0" w:type="dxa"/>
-          </w:tblCellMar>
-        </w:tblPrEx>
         <w:tc>
           <w:tcPr>
             <w:tcW w:w="900" w:type="dxa"/>
@@ -6491,12 +6182,6 @@
         </w:tc>
       </w:tr>
       <w:tr>
-        <w:tblPrEx>
-          <w:tblCellMar>
-            <w:top w:w="0" w:type="dxa"/>
-            <w:bottom w:w="0" w:type="dxa"/>
-          </w:tblCellMar>
-        </w:tblPrEx>
         <w:tc>
           <w:tcPr>
             <w:tcW w:w="900" w:type="dxa"/>
@@ -6545,12 +6230,6 @@
         </w:tc>
       </w:tr>
       <w:tr>
-        <w:tblPrEx>
-          <w:tblCellMar>
-            <w:top w:w="0" w:type="dxa"/>
-            <w:bottom w:w="0" w:type="dxa"/>
-          </w:tblCellMar>
-        </w:tblPrEx>
         <w:tc>
           <w:tcPr>
             <w:tcW w:w="900" w:type="dxa"/>
@@ -6599,12 +6278,6 @@
         </w:tc>
       </w:tr>
       <w:tr>
-        <w:tblPrEx>
-          <w:tblCellMar>
-            <w:top w:w="0" w:type="dxa"/>
-            <w:bottom w:w="0" w:type="dxa"/>
-          </w:tblCellMar>
-        </w:tblPrEx>
         <w:tc>
           <w:tcPr>
             <w:tcW w:w="900" w:type="dxa"/>
@@ -6653,12 +6326,6 @@
         </w:tc>
       </w:tr>
       <w:tr>
-        <w:tblPrEx>
-          <w:tblCellMar>
-            <w:top w:w="0" w:type="dxa"/>
-            <w:bottom w:w="0" w:type="dxa"/>
-          </w:tblCellMar>
-        </w:tblPrEx>
         <w:tc>
           <w:tcPr>
             <w:tcW w:w="900" w:type="dxa"/>
@@ -6717,7 +6384,7 @@
         <w:pStyle w:val="Titre2"/>
         <w:spacing w:before="360" w:after="180"/>
       </w:pPr>
-      <w:bookmarkStart w:id="17" w:name="_Toc234165106"/>
+      <w:bookmarkStart w:id="18" w:name="_Toc234165106"/>
       <w:r>
         <w:rPr>
           <w:b/>
@@ -6727,7 +6394,7 @@
         <w:lastRenderedPageBreak/>
         <w:t>2.7 Diagramme de cas d'utilisation</w:t>
       </w:r>
-      <w:bookmarkEnd w:id="17"/>
+      <w:bookmarkEnd w:id="18"/>
     </w:p>
     <w:p>
       <w:pPr>
@@ -6847,7 +6514,7 @@
         <w:pStyle w:val="Titre3"/>
         <w:spacing w:before="240" w:after="120"/>
       </w:pPr>
-      <w:bookmarkStart w:id="18" w:name="_Toc234165107"/>
+      <w:bookmarkStart w:id="19" w:name="_Toc234165107"/>
       <w:r>
         <w:rPr>
           <w:b/>
@@ -6858,7 +6525,7 @@
         </w:rPr>
         <w:t>2.7.1 Description détaillée du cas d'utilisation « Approuver un litige »</w:t>
       </w:r>
-      <w:bookmarkEnd w:id="18"/>
+      <w:bookmarkEnd w:id="19"/>
     </w:p>
     <w:p>
       <w:pPr>
@@ -6892,12 +6559,6 @@
         <w:gridCol w:w="7100"/>
       </w:tblGrid>
       <w:tr>
-        <w:tblPrEx>
-          <w:tblCellMar>
-            <w:top w:w="0" w:type="dxa"/>
-            <w:bottom w:w="0" w:type="dxa"/>
-          </w:tblCellMar>
-        </w:tblPrEx>
         <w:trPr>
           <w:tblHeader/>
         </w:trPr>
@@ -6954,12 +6615,6 @@
         </w:tc>
       </w:tr>
       <w:tr>
-        <w:tblPrEx>
-          <w:tblCellMar>
-            <w:top w:w="0" w:type="dxa"/>
-            <w:bottom w:w="0" w:type="dxa"/>
-          </w:tblCellMar>
-        </w:tblPrEx>
         <w:tc>
           <w:tcPr>
             <w:tcW w:w="2600" w:type="dxa"/>
@@ -7008,12 +6663,6 @@
         </w:tc>
       </w:tr>
       <w:tr>
-        <w:tblPrEx>
-          <w:tblCellMar>
-            <w:top w:w="0" w:type="dxa"/>
-            <w:bottom w:w="0" w:type="dxa"/>
-          </w:tblCellMar>
-        </w:tblPrEx>
         <w:tc>
           <w:tcPr>
             <w:tcW w:w="2600" w:type="dxa"/>
@@ -7062,12 +6711,6 @@
         </w:tc>
       </w:tr>
       <w:tr>
-        <w:tblPrEx>
-          <w:tblCellMar>
-            <w:top w:w="0" w:type="dxa"/>
-            <w:bottom w:w="0" w:type="dxa"/>
-          </w:tblCellMar>
-        </w:tblPrEx>
         <w:tc>
           <w:tcPr>
             <w:tcW w:w="2600" w:type="dxa"/>
@@ -7116,12 +6759,6 @@
         </w:tc>
       </w:tr>
       <w:tr>
-        <w:tblPrEx>
-          <w:tblCellMar>
-            <w:top w:w="0" w:type="dxa"/>
-            <w:bottom w:w="0" w:type="dxa"/>
-          </w:tblCellMar>
-        </w:tblPrEx>
         <w:tc>
           <w:tcPr>
             <w:tcW w:w="2600" w:type="dxa"/>
@@ -7170,12 +6807,6 @@
         </w:tc>
       </w:tr>
       <w:tr>
-        <w:tblPrEx>
-          <w:tblCellMar>
-            <w:top w:w="0" w:type="dxa"/>
-            <w:bottom w:w="0" w:type="dxa"/>
-          </w:tblCellMar>
-        </w:tblPrEx>
         <w:tc>
           <w:tcPr>
             <w:tcW w:w="2600" w:type="dxa"/>
@@ -7248,7 +6879,7 @@
         <w:pStyle w:val="Titre2"/>
         <w:spacing w:before="360" w:after="180"/>
       </w:pPr>
-      <w:bookmarkStart w:id="19" w:name="_Toc234165108"/>
+      <w:bookmarkStart w:id="20" w:name="_Toc234165108"/>
       <w:r>
         <w:rPr>
           <w:b/>
@@ -7258,7 +6889,7 @@
         <w:lastRenderedPageBreak/>
         <w:t>2.8 Conception : diagramme de classes</w:t>
       </w:r>
-      <w:bookmarkEnd w:id="19"/>
+      <w:bookmarkEnd w:id="20"/>
     </w:p>
     <w:p>
       <w:pPr>
@@ -7342,7 +6973,7 @@
         <w:pStyle w:val="Titre3"/>
         <w:spacing w:before="240" w:after="120"/>
       </w:pPr>
-      <w:bookmarkStart w:id="20" w:name="_Toc234165109"/>
+      <w:bookmarkStart w:id="21" w:name="_Toc234165109"/>
       <w:r>
         <w:rPr>
           <w:b/>
@@ -7353,7 +6984,7 @@
         </w:rPr>
         <w:t>2.8.1 Description des classes</w:t>
       </w:r>
-      <w:bookmarkEnd w:id="20"/>
+      <w:bookmarkEnd w:id="21"/>
     </w:p>
     <w:p>
       <w:pPr>
@@ -7470,7 +7101,7 @@
         <w:pStyle w:val="Titre3"/>
         <w:spacing w:before="240" w:after="120"/>
       </w:pPr>
-      <w:bookmarkStart w:id="21" w:name="_Toc234165110"/>
+      <w:bookmarkStart w:id="22" w:name="_Toc234165110"/>
       <w:r>
         <w:rPr>
           <w:b/>
@@ -7481,7 +7112,7 @@
         </w:rPr>
         <w:t>2.8.2 Justification des relations principales</w:t>
       </w:r>
-      <w:bookmarkEnd w:id="21"/>
+      <w:bookmarkEnd w:id="22"/>
     </w:p>
     <w:p>
       <w:pPr>
@@ -7558,7 +7189,7 @@
         <w:pStyle w:val="Titre2"/>
         <w:spacing w:before="360" w:after="180"/>
       </w:pPr>
-      <w:bookmarkStart w:id="22" w:name="_Toc234165111"/>
+      <w:bookmarkStart w:id="23" w:name="_Toc234165111"/>
       <w:r>
         <w:rPr>
           <w:b/>
@@ -7568,7 +7199,7 @@
         <w:lastRenderedPageBreak/>
         <w:t>2.9 Conception : diagramme de séquence</w:t>
       </w:r>
-      <w:bookmarkEnd w:id="22"/>
+      <w:bookmarkEnd w:id="23"/>
     </w:p>
     <w:p>
       <w:pPr>
@@ -7658,7 +7289,7 @@
         <w:pStyle w:val="Titre2"/>
         <w:spacing w:before="360" w:after="180"/>
       </w:pPr>
-      <w:bookmarkStart w:id="23" w:name="_Toc234165112"/>
+      <w:bookmarkStart w:id="24" w:name="_Toc234165112"/>
       <w:r>
         <w:rPr>
           <w:b/>
@@ -7667,8 +7298,6 @@
         </w:rPr>
         <w:t>2.10 Conclusion du chapitre</w:t>
       </w:r>
-      <w:bookmarkStart w:id="24" w:name="_GoBack"/>
-      <w:bookmarkEnd w:id="23"/>
       <w:bookmarkEnd w:id="24"/>
     </w:p>
     <w:p>

</xml_diff>